<commit_message>
Objetivos generales y específicos corregidos
</commit_message>
<xml_diff>
--- a/docs/Entregables/ACTIVIDAD 1-R.docx
+++ b/docs/Entregables/ACTIVIDAD 1-R.docx
@@ -1,6 +1,6 @@
 
 <file path=word/document.xml><?xml version="1.0" encoding="utf-8"?>
-<w:document xmlns:wpc="http://schemas.microsoft.com/office/word/2010/wordprocessingCanvas" xmlns:cx="http://schemas.microsoft.com/office/drawing/2014/chartex" xmlns:cx1="http://schemas.microsoft.com/office/drawing/2015/9/8/chartex" xmlns:cx2="http://schemas.microsoft.com/office/drawing/2015/10/21/chartex" xmlns:cx3="http://schemas.microsoft.com/office/drawing/2016/5/9/chartex" xmlns:cx4="http://schemas.microsoft.com/office/drawing/2016/5/10/chartex" xmlns:cx5="http://schemas.microsoft.com/office/drawing/2016/5/11/chartex" xmlns:cx6="http://schemas.microsoft.com/office/drawing/2016/5/12/chartex" xmlns:cx7="http://schemas.microsoft.com/office/drawing/2016/5/13/chartex" xmlns:cx8="http://schemas.microsoft.com/office/drawing/2016/5/14/chartex" xmlns:mc="http://schemas.openxmlformats.org/markup-compatibility/2006" xmlns:aink="http://schemas.microsoft.com/office/drawing/2016/ink" xmlns:am3d="http://schemas.microsoft.com/office/drawing/2017/model3d" xmlns:o="urn:schemas-microsoft-com:office:office" xmlns:oel="http://schemas.microsoft.com/office/2019/extlst" xmlns:r="http://schemas.openxmlformats.org/officeDocument/2006/relationships" xmlns:m="http://schemas.openxmlformats.org/officeDocument/2006/math" xmlns:v="urn:schemas-microsoft-com:vml" xmlns:wp14="http://schemas.microsoft.com/office/word/2010/wordprocessingDrawing" xmlns:wp="http://schemas.openxmlformats.org/drawingml/2006/wordprocessingDrawing" xmlns:w10="urn:schemas-microsoft-com:office:word" xmlns:w="http://schemas.openxmlformats.org/wordprocessingml/2006/main" xmlns:w14="http://schemas.microsoft.com/office/word/2010/wordml" xmlns:w15="http://schemas.microsoft.com/office/word/2012/wordml" xmlns:w16cex="http://schemas.microsoft.com/office/word/2018/wordml/cex" xmlns:w16cid="http://schemas.microsoft.com/office/word/2016/wordml/cid" xmlns:w16="http://schemas.microsoft.com/office/word/2018/wordml" xmlns:w16du="http://schemas.microsoft.com/office/word/2023/wordml/word16du" xmlns:w16sdtdh="http://schemas.microsoft.com/office/word/2020/wordml/sdtdatahash" xmlns:w16sdtfl="http://schemas.microsoft.com/office/word/2024/wordml/sdtformatlock" xmlns:w16se="http://schemas.microsoft.com/office/word/2015/wordml/symex" xmlns:wpg="http://schemas.microsoft.com/office/word/2010/wordprocessingGroup" xmlns:wpi="http://schemas.microsoft.com/office/word/2010/wordprocessingInk" xmlns:wne="http://schemas.microsoft.com/office/word/2006/wordml" xmlns:wps="http://schemas.microsoft.com/office/word/2010/wordprocessingShape" mc:Ignorable="w14 w15 w16se w16cid w16 w16cex w16sdtdh w16sdtfl w16du wp14">
+<w:document xmlns:wpc="http://schemas.microsoft.com/office/word/2010/wordprocessingCanvas" xmlns:cx="http://schemas.microsoft.com/office/drawing/2014/chartex" xmlns:cx1="http://schemas.microsoft.com/office/drawing/2015/9/8/chartex" xmlns:cx2="http://schemas.microsoft.com/office/drawing/2015/10/21/chartex" xmlns:cx3="http://schemas.microsoft.com/office/drawing/2016/5/9/chartex" xmlns:cx4="http://schemas.microsoft.com/office/drawing/2016/5/10/chartex" xmlns:cx5="http://schemas.microsoft.com/office/drawing/2016/5/11/chartex" xmlns:cx6="http://schemas.microsoft.com/office/drawing/2016/5/12/chartex" xmlns:cx7="http://schemas.microsoft.com/office/drawing/2016/5/13/chartex" xmlns:cx8="http://schemas.microsoft.com/office/drawing/2016/5/14/chartex" xmlns:mc="http://schemas.openxmlformats.org/markup-compatibility/2006" xmlns:aink="http://schemas.microsoft.com/office/drawing/2016/ink" xmlns:am3d="http://schemas.microsoft.com/office/drawing/2017/model3d" xmlns:o="urn:schemas-microsoft-com:office:office" xmlns:oel="http://schemas.microsoft.com/office/2019/extlst" xmlns:r="http://schemas.openxmlformats.org/officeDocument/2006/relationships" xmlns:m="http://schemas.openxmlformats.org/officeDocument/2006/math" xmlns:v="urn:schemas-microsoft-com:vml" xmlns:wp14="http://schemas.microsoft.com/office/word/2010/wordprocessingDrawing" xmlns:wp="http://schemas.openxmlformats.org/drawingml/2006/wordprocessingDrawing" xmlns:w10="urn:schemas-microsoft-com:office:word" xmlns:w="http://schemas.openxmlformats.org/wordprocessingml/2006/main" xmlns:w14="http://schemas.microsoft.com/office/word/2010/wordml" xmlns:w15="http://schemas.microsoft.com/office/word/2012/wordml" xmlns:w16cex="http://schemas.microsoft.com/office/word/2018/wordml/cex" xmlns:w16cid="http://schemas.microsoft.com/office/word/2016/wordml/cid" xmlns:w16="http://schemas.microsoft.com/office/word/2018/wordml" xmlns:w16sdtdh="http://schemas.microsoft.com/office/word/2020/wordml/sdtdatahash" xmlns:w16se="http://schemas.microsoft.com/office/word/2015/wordml/symex" xmlns:wpg="http://schemas.microsoft.com/office/word/2010/wordprocessingGroup" xmlns:wpi="http://schemas.microsoft.com/office/word/2010/wordprocessingInk" xmlns:wne="http://schemas.microsoft.com/office/word/2006/wordml" xmlns:wps="http://schemas.microsoft.com/office/word/2010/wordprocessingShape" mc:Ignorable="w14 w15 w16se w16cid w16 w16cex w16sdtdh wp14">
   <w:body>
     <w:p>
       <w:pPr>
@@ -135,7 +135,7 @@
               </wp:anchor>
             </w:drawing>
           </mc:Choice>
-          <mc:Fallback>
+          <mc:Fallback xmlns:w16sdtfl="http://schemas.microsoft.com/office/word/2024/wordml/sdtformatlock" xmlns:w16du="http://schemas.microsoft.com/office/word/2023/wordml/word16du">
             <w:pict>
               <v:shapetype w14:anchorId="716D3AB1" id="_x0000_t202" coordsize="21600,21600" o:spt="202" path="m,l,21600r21600,l21600,xe">
                 <v:stroke joinstyle="miter"/>
@@ -352,7 +352,7 @@
               </wp:anchor>
             </w:drawing>
           </mc:Choice>
-          <mc:Fallback>
+          <mc:Fallback xmlns:w16sdtfl="http://schemas.microsoft.com/office/word/2024/wordml/sdtformatlock" xmlns:w16du="http://schemas.microsoft.com/office/word/2023/wordml/word16du">
             <w:pict>
               <v:shape w14:anchorId="2F091EB2" id="_x0000_s1027" type="#_x0000_t202" style="position:absolute;left:0;text-align:left;margin-left:30.35pt;margin-top:283.2pt;width:408.75pt;height:76.2pt;z-index:251659264;visibility:visible;mso-wrap-style:square;mso-width-percent:0;mso-height-percent:200;mso-wrap-distance-left:9pt;mso-wrap-distance-top:3.6pt;mso-wrap-distance-right:9pt;mso-wrap-distance-bottom:3.6pt;mso-position-horizontal:absolute;mso-position-horizontal-relative:text;mso-position-vertical:absolute;mso-position-vertical-relative:text;mso-width-percent:0;mso-height-percent:200;mso-width-relative:margin;mso-height-relative:margin;v-text-anchor:top" o:gfxdata="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" filled="f" stroked="f">
                 <v:textbox style="mso-fit-shape-to-text:t">
@@ -540,7 +540,7 @@
               </wp:anchor>
             </w:drawing>
           </mc:Choice>
-          <mc:Fallback>
+          <mc:Fallback xmlns:w16sdtfl="http://schemas.microsoft.com/office/word/2024/wordml/sdtformatlock" xmlns:w16du="http://schemas.microsoft.com/office/word/2023/wordml/word16du">
             <w:pict>
               <v:shape w14:anchorId="4D874EF6" id="_x0000_s1028" type="#_x0000_t202" style="position:absolute;left:0;text-align:left;margin-left:30.35pt;margin-top:490.25pt;width:408.75pt;height:38.45pt;z-index:251661312;visibility:visible;mso-wrap-style:square;mso-width-percent:0;mso-height-percent:200;mso-wrap-distance-left:9pt;mso-wrap-distance-top:3.6pt;mso-wrap-distance-right:9pt;mso-wrap-distance-bottom:3.6pt;mso-position-horizontal:absolute;mso-position-horizontal-relative:text;mso-position-vertical:absolute;mso-position-vertical-relative:text;mso-width-percent:0;mso-height-percent:200;mso-width-relative:margin;mso-height-relative:margin;v-text-anchor:top" o:gfxdata="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" filled="f" stroked="f">
                 <v:textbox style="mso-fit-shape-to-text:t">
@@ -649,7 +649,15 @@
         <w:t xml:space="preserve"> </w:t>
       </w:r>
       <w:r>
-        <w:t>Desarrollar una aplicación de escritorio para la empresa “Repuestos Anelisa” que permita gestionar eficientemente el inventario, optimizando los procesos administrativos y mejorando el control de entradas y salidas de productos.</w:t>
+        <w:t xml:space="preserve">Desarrollar una aplicación de escritorio para la empresa “Repuestos </w:t>
+      </w:r>
+      <w:proofErr w:type="spellStart"/>
+      <w:r>
+        <w:t>Anelisa</w:t>
+      </w:r>
+      <w:proofErr w:type="spellEnd"/>
+      <w:r>
+        <w:t>” que permita gestionar eficientemente el inventario, optimizando los procesos administrativos y mejorando el control de entradas y salidas de productos</w:t>
       </w:r>
     </w:p>
     <w:p>
@@ -674,13 +682,52 @@
           <w:ilvl w:val="0"/>
           <w:numId w:val="2"/>
         </w:numPr>
+      </w:pPr>
+      <w:r>
+        <w:t>Analizar la situación actual de la empresa mediante entrevistas con el cliente y evaluación de los procesos de inventario, identificando las necesidades funcionales y no funcionales del sistema.</w:t>
+      </w:r>
+    </w:p>
+    <w:p>
+      <w:pPr>
+        <w:pStyle w:val="Prrafodelista"/>
+        <w:numPr>
+          <w:ilvl w:val="0"/>
+          <w:numId w:val="2"/>
+        </w:numPr>
         <w:rPr>
           <w:b/>
           <w:bCs/>
+          <w:sz w:val="20"/>
+          <w:szCs w:val="20"/>
         </w:rPr>
       </w:pPr>
       <w:r>
-        <w:t>Permitir el registro, actualización, consulta y eliminación de productos del inventario.</w:t>
+        <w:rPr>
+          <w:rFonts w:eastAsia="Arial" w:cs="Arial"/>
+          <w:color w:val="000000"/>
+        </w:rPr>
+        <w:t>Diseñar la estructura del sistema utilizando herramientas visuales como mockups</w:t>
+      </w:r>
+      <w:r>
+        <w:rPr>
+          <w:rFonts w:eastAsia="Arial" w:cs="Arial"/>
+          <w:color w:val="000000"/>
+        </w:rPr>
+        <w:t xml:space="preserve"> </w:t>
+      </w:r>
+      <w:r>
+        <w:rPr>
+          <w:rFonts w:eastAsia="Arial" w:cs="Arial"/>
+          <w:color w:val="000000"/>
+        </w:rPr>
+        <w:t>y casos de uso, asegurando una propuesta intuitiva y acorde a los requerimientos del negocio</w:t>
+      </w:r>
+      <w:r>
+        <w:rPr>
+          <w:rFonts w:eastAsia="Arial" w:cs="Arial"/>
+          <w:color w:val="000000"/>
+        </w:rPr>
+        <w:t>.</w:t>
       </w:r>
     </w:p>
     <w:p>
@@ -696,7 +743,13 @@
         </w:rPr>
       </w:pPr>
       <w:r>
-        <w:t>Registrar compras a proveedores y ventas a clientes, actualizando las existencias correspondientes.</w:t>
+        <w:rPr>
+          <w:rFonts w:hint="eastAsia"/>
+        </w:rPr>
+        <w:t>Implementar la aplicación de escritorio desarrollando módulos específicos para la gestión de inventario, ventas, compras y control de usuarios</w:t>
+      </w:r>
+      <w:r>
+        <w:t>.</w:t>
       </w:r>
     </w:p>
     <w:p>
@@ -712,47 +765,21 @@
         </w:rPr>
       </w:pPr>
       <w:r>
-        <w:t>Generar reportes administrativos de inventario, compras y ventas para apoyar la toma de decisiones.</w:t>
+        <w:rPr>
+          <w:rFonts w:hint="eastAsia"/>
+        </w:rPr>
+        <w:lastRenderedPageBreak/>
+        <w:t>Validar el funcionamiento de la aplicación mediante pruebas internas y revisión con el cliente, garantizando el cumplimiento de los requisitos planteados y la correcta operatividad del sistema</w:t>
+      </w:r>
+      <w:r>
+        <w:t>.</w:t>
       </w:r>
     </w:p>
     <w:p>
       <w:pPr>
-        <w:pStyle w:val="Prrafodelista"/>
-        <w:numPr>
-          <w:ilvl w:val="0"/>
-          <w:numId w:val="2"/>
-        </w:numPr>
-        <w:rPr>
-          <w:b/>
-          <w:bCs/>
-        </w:rPr>
+        <w:pStyle w:val="Ttulo1"/>
       </w:pPr>
       <w:r>
-        <w:t>Gestionar el acceso al sistema mediante roles y niveles de permiso diferenciados.</w:t>
-      </w:r>
-    </w:p>
-    <w:p>
-      <w:pPr>
-        <w:pStyle w:val="Prrafodelista"/>
-        <w:numPr>
-          <w:ilvl w:val="0"/>
-          <w:numId w:val="2"/>
-        </w:numPr>
-        <w:rPr>
-          <w:b/>
-          <w:bCs/>
-        </w:rPr>
-      </w:pPr>
-      <w:r>
-        <w:t>Facilitar la consulta rápida de existencias y la identificación de productos mediante datos de referencia.</w:t>
-      </w:r>
-    </w:p>
-    <w:p>
-      <w:pPr>
-        <w:pStyle w:val="Ttulo1"/>
-      </w:pPr>
-      <w:r>
-        <w:lastRenderedPageBreak/>
         <w:t>Descripción General</w:t>
       </w:r>
     </w:p>
@@ -1053,6 +1080,7 @@
         </w:numPr>
       </w:pPr>
       <w:r>
+        <w:lastRenderedPageBreak/>
         <w:t>Acceso desde dispositivos móviles.</w:t>
       </w:r>
     </w:p>
@@ -1073,7 +1101,6 @@
         <w:pStyle w:val="Ttulo1"/>
       </w:pPr>
       <w:r>
-        <w:lastRenderedPageBreak/>
         <w:t>Requisitos Funcionales</w:t>
       </w:r>
     </w:p>
@@ -1601,6 +1628,7 @@
           </w:tcPr>
           <w:p>
             <w:r>
+              <w:lastRenderedPageBreak/>
               <w:t xml:space="preserve">Salida: </w:t>
             </w:r>
             <w:r>
@@ -1648,7 +1676,6 @@
                 <w:bCs/>
                 <w:color w:val="FFFFFF" w:themeColor="background1"/>
               </w:rPr>
-              <w:lastRenderedPageBreak/>
               <w:t>Código: RF0</w:t>
             </w:r>
             <w:r>
@@ -5054,7 +5081,7 @@
 </file>
 
 <file path=word/endnotes.xml><?xml version="1.0" encoding="utf-8"?>
-<w:endnotes xmlns:wpc="http://schemas.microsoft.com/office/word/2010/wordprocessingCanvas" xmlns:cx="http://schemas.microsoft.com/office/drawing/2014/chartex" xmlns:cx1="http://schemas.microsoft.com/office/drawing/2015/9/8/chartex" xmlns:cx2="http://schemas.microsoft.com/office/drawing/2015/10/21/chartex" xmlns:cx3="http://schemas.microsoft.com/office/drawing/2016/5/9/chartex" xmlns:cx4="http://schemas.microsoft.com/office/drawing/2016/5/10/chartex" xmlns:cx5="http://schemas.microsoft.com/office/drawing/2016/5/11/chartex" xmlns:cx6="http://schemas.microsoft.com/office/drawing/2016/5/12/chartex" xmlns:cx7="http://schemas.microsoft.com/office/drawing/2016/5/13/chartex" xmlns:cx8="http://schemas.microsoft.com/office/drawing/2016/5/14/chartex" xmlns:mc="http://schemas.openxmlformats.org/markup-compatibility/2006" xmlns:aink="http://schemas.microsoft.com/office/drawing/2016/ink" xmlns:am3d="http://schemas.microsoft.com/office/drawing/2017/model3d" xmlns:o="urn:schemas-microsoft-com:office:office" xmlns:oel="http://schemas.microsoft.com/office/2019/extlst" xmlns:r="http://schemas.openxmlformats.org/officeDocument/2006/relationships" xmlns:m="http://schemas.openxmlformats.org/officeDocument/2006/math" xmlns:v="urn:schemas-microsoft-com:vml" xmlns:wp14="http://schemas.microsoft.com/office/word/2010/wordprocessingDrawing" xmlns:wp="http://schemas.openxmlformats.org/drawingml/2006/wordprocessingDrawing" xmlns:w10="urn:schemas-microsoft-com:office:word" xmlns:w="http://schemas.openxmlformats.org/wordprocessingml/2006/main" xmlns:w14="http://schemas.microsoft.com/office/word/2010/wordml" xmlns:w15="http://schemas.microsoft.com/office/word/2012/wordml" xmlns:w16cex="http://schemas.microsoft.com/office/word/2018/wordml/cex" xmlns:w16cid="http://schemas.microsoft.com/office/word/2016/wordml/cid" xmlns:w16="http://schemas.microsoft.com/office/word/2018/wordml" xmlns:w16du="http://schemas.microsoft.com/office/word/2023/wordml/word16du" xmlns:w16sdtdh="http://schemas.microsoft.com/office/word/2020/wordml/sdtdatahash" xmlns:w16sdtfl="http://schemas.microsoft.com/office/word/2024/wordml/sdtformatlock" xmlns:w16se="http://schemas.microsoft.com/office/word/2015/wordml/symex" xmlns:wpg="http://schemas.microsoft.com/office/word/2010/wordprocessingGroup" xmlns:wpi="http://schemas.microsoft.com/office/word/2010/wordprocessingInk" xmlns:wne="http://schemas.microsoft.com/office/word/2006/wordml" xmlns:wps="http://schemas.microsoft.com/office/word/2010/wordprocessingShape" mc:Ignorable="w14 w15 w16se w16cid w16 w16cex w16sdtdh w16sdtfl w16du wp14">
+<w:endnotes xmlns:wpc="http://schemas.microsoft.com/office/word/2010/wordprocessingCanvas" xmlns:cx="http://schemas.microsoft.com/office/drawing/2014/chartex" xmlns:cx1="http://schemas.microsoft.com/office/drawing/2015/9/8/chartex" xmlns:cx2="http://schemas.microsoft.com/office/drawing/2015/10/21/chartex" xmlns:cx3="http://schemas.microsoft.com/office/drawing/2016/5/9/chartex" xmlns:cx4="http://schemas.microsoft.com/office/drawing/2016/5/10/chartex" xmlns:cx5="http://schemas.microsoft.com/office/drawing/2016/5/11/chartex" xmlns:cx6="http://schemas.microsoft.com/office/drawing/2016/5/12/chartex" xmlns:cx7="http://schemas.microsoft.com/office/drawing/2016/5/13/chartex" xmlns:cx8="http://schemas.microsoft.com/office/drawing/2016/5/14/chartex" xmlns:mc="http://schemas.openxmlformats.org/markup-compatibility/2006" xmlns:aink="http://schemas.microsoft.com/office/drawing/2016/ink" xmlns:am3d="http://schemas.microsoft.com/office/drawing/2017/model3d" xmlns:o="urn:schemas-microsoft-com:office:office" xmlns:oel="http://schemas.microsoft.com/office/2019/extlst" xmlns:r="http://schemas.openxmlformats.org/officeDocument/2006/relationships" xmlns:m="http://schemas.openxmlformats.org/officeDocument/2006/math" xmlns:v="urn:schemas-microsoft-com:vml" xmlns:wp14="http://schemas.microsoft.com/office/word/2010/wordprocessingDrawing" xmlns:wp="http://schemas.openxmlformats.org/drawingml/2006/wordprocessingDrawing" xmlns:w10="urn:schemas-microsoft-com:office:word" xmlns:w="http://schemas.openxmlformats.org/wordprocessingml/2006/main" xmlns:w14="http://schemas.microsoft.com/office/word/2010/wordml" xmlns:w15="http://schemas.microsoft.com/office/word/2012/wordml" xmlns:w16cex="http://schemas.microsoft.com/office/word/2018/wordml/cex" xmlns:w16cid="http://schemas.microsoft.com/office/word/2016/wordml/cid" xmlns:w16="http://schemas.microsoft.com/office/word/2018/wordml" xmlns:w16sdtdh="http://schemas.microsoft.com/office/word/2020/wordml/sdtdatahash" xmlns:w16se="http://schemas.microsoft.com/office/word/2015/wordml/symex" xmlns:wpg="http://schemas.microsoft.com/office/word/2010/wordprocessingGroup" xmlns:wpi="http://schemas.microsoft.com/office/word/2010/wordprocessingInk" xmlns:wne="http://schemas.microsoft.com/office/word/2006/wordml" xmlns:wps="http://schemas.microsoft.com/office/word/2010/wordprocessingShape" mc:Ignorable="w14 w15 w16se w16cid w16 w16cex w16sdtdh wp14">
   <w:endnote w:type="separator" w:id="-1">
     <w:p>
       <w:pPr>
@@ -5079,7 +5106,7 @@
 </file>
 
 <file path=word/footer1.xml><?xml version="1.0" encoding="utf-8"?>
-<w:ftr xmlns:wpc="http://schemas.microsoft.com/office/word/2010/wordprocessingCanvas" xmlns:cx="http://schemas.microsoft.com/office/drawing/2014/chartex" xmlns:cx1="http://schemas.microsoft.com/office/drawing/2015/9/8/chartex" xmlns:cx2="http://schemas.microsoft.com/office/drawing/2015/10/21/chartex" xmlns:cx3="http://schemas.microsoft.com/office/drawing/2016/5/9/chartex" xmlns:cx4="http://schemas.microsoft.com/office/drawing/2016/5/10/chartex" xmlns:cx5="http://schemas.microsoft.com/office/drawing/2016/5/11/chartex" xmlns:cx6="http://schemas.microsoft.com/office/drawing/2016/5/12/chartex" xmlns:cx7="http://schemas.microsoft.com/office/drawing/2016/5/13/chartex" xmlns:cx8="http://schemas.microsoft.com/office/drawing/2016/5/14/chartex" xmlns:mc="http://schemas.openxmlformats.org/markup-compatibility/2006" xmlns:aink="http://schemas.microsoft.com/office/drawing/2016/ink" xmlns:am3d="http://schemas.microsoft.com/office/drawing/2017/model3d" xmlns:o="urn:schemas-microsoft-com:office:office" xmlns:oel="http://schemas.microsoft.com/office/2019/extlst" xmlns:r="http://schemas.openxmlformats.org/officeDocument/2006/relationships" xmlns:m="http://schemas.openxmlformats.org/officeDocument/2006/math" xmlns:v="urn:schemas-microsoft-com:vml" xmlns:wp14="http://schemas.microsoft.com/office/word/2010/wordprocessingDrawing" xmlns:wp="http://schemas.openxmlformats.org/drawingml/2006/wordprocessingDrawing" xmlns:w10="urn:schemas-microsoft-com:office:word" xmlns:w="http://schemas.openxmlformats.org/wordprocessingml/2006/main" xmlns:w14="http://schemas.microsoft.com/office/word/2010/wordml" xmlns:w15="http://schemas.microsoft.com/office/word/2012/wordml" xmlns:w16cex="http://schemas.microsoft.com/office/word/2018/wordml/cex" xmlns:w16cid="http://schemas.microsoft.com/office/word/2016/wordml/cid" xmlns:w16="http://schemas.microsoft.com/office/word/2018/wordml" xmlns:w16du="http://schemas.microsoft.com/office/word/2023/wordml/word16du" xmlns:w16sdtdh="http://schemas.microsoft.com/office/word/2020/wordml/sdtdatahash" xmlns:w16sdtfl="http://schemas.microsoft.com/office/word/2024/wordml/sdtformatlock" xmlns:w16se="http://schemas.microsoft.com/office/word/2015/wordml/symex" xmlns:wpg="http://schemas.microsoft.com/office/word/2010/wordprocessingGroup" xmlns:wpi="http://schemas.microsoft.com/office/word/2010/wordprocessingInk" xmlns:wne="http://schemas.microsoft.com/office/word/2006/wordml" xmlns:wps="http://schemas.microsoft.com/office/word/2010/wordprocessingShape" mc:Ignorable="w14 w15 w16se w16cid w16 w16cex w16sdtdh w16sdtfl w16du wp14">
+<w:ftr xmlns:wpc="http://schemas.microsoft.com/office/word/2010/wordprocessingCanvas" xmlns:cx="http://schemas.microsoft.com/office/drawing/2014/chartex" xmlns:cx1="http://schemas.microsoft.com/office/drawing/2015/9/8/chartex" xmlns:cx2="http://schemas.microsoft.com/office/drawing/2015/10/21/chartex" xmlns:cx3="http://schemas.microsoft.com/office/drawing/2016/5/9/chartex" xmlns:cx4="http://schemas.microsoft.com/office/drawing/2016/5/10/chartex" xmlns:cx5="http://schemas.microsoft.com/office/drawing/2016/5/11/chartex" xmlns:cx6="http://schemas.microsoft.com/office/drawing/2016/5/12/chartex" xmlns:cx7="http://schemas.microsoft.com/office/drawing/2016/5/13/chartex" xmlns:cx8="http://schemas.microsoft.com/office/drawing/2016/5/14/chartex" xmlns:mc="http://schemas.openxmlformats.org/markup-compatibility/2006" xmlns:aink="http://schemas.microsoft.com/office/drawing/2016/ink" xmlns:am3d="http://schemas.microsoft.com/office/drawing/2017/model3d" xmlns:o="urn:schemas-microsoft-com:office:office" xmlns:oel="http://schemas.microsoft.com/office/2019/extlst" xmlns:r="http://schemas.openxmlformats.org/officeDocument/2006/relationships" xmlns:m="http://schemas.openxmlformats.org/officeDocument/2006/math" xmlns:v="urn:schemas-microsoft-com:vml" xmlns:wp14="http://schemas.microsoft.com/office/word/2010/wordprocessingDrawing" xmlns:wp="http://schemas.openxmlformats.org/drawingml/2006/wordprocessingDrawing" xmlns:w10="urn:schemas-microsoft-com:office:word" xmlns:w="http://schemas.openxmlformats.org/wordprocessingml/2006/main" xmlns:w14="http://schemas.microsoft.com/office/word/2010/wordml" xmlns:w15="http://schemas.microsoft.com/office/word/2012/wordml" xmlns:w16cex="http://schemas.microsoft.com/office/word/2018/wordml/cex" xmlns:w16cid="http://schemas.microsoft.com/office/word/2016/wordml/cid" xmlns:w16="http://schemas.microsoft.com/office/word/2018/wordml" xmlns:w16sdtdh="http://schemas.microsoft.com/office/word/2020/wordml/sdtdatahash" xmlns:w16se="http://schemas.microsoft.com/office/word/2015/wordml/symex" xmlns:wpg="http://schemas.microsoft.com/office/word/2010/wordprocessingGroup" xmlns:wpi="http://schemas.microsoft.com/office/word/2010/wordprocessingInk" xmlns:wne="http://schemas.microsoft.com/office/word/2006/wordml" xmlns:wps="http://schemas.microsoft.com/office/word/2010/wordprocessingShape" mc:Ignorable="w14 w15 w16se w16cid w16 w16cex w16sdtdh wp14">
   <w:p>
     <w:pPr>
       <w:pStyle w:val="Piedepgina"/>
@@ -5401,7 +5428,7 @@
             </wp:anchor>
           </w:drawing>
         </mc:Choice>
-        <mc:Fallback>
+        <mc:Fallback xmlns:w16sdtfl="http://schemas.microsoft.com/office/word/2024/wordml/sdtformatlock" xmlns:w16du="http://schemas.microsoft.com/office/word/2023/wordml/word16du">
           <w:pict>
             <v:group w14:anchorId="6F17EF8F" id="Grupo 7" o:spid="_x0000_s1029" style="position:absolute;left:0;text-align:left;margin-left:-70.9pt;margin-top:-33.85pt;width:612pt;height:88.1pt;z-index:251666432" coordsize="77724,11190" o:gfxdata="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">
               <v:shapetype id="_x0000_t75" coordsize="21600,21600" o:spt="75" o:preferrelative="t" path="m@4@5l@4@11@9@11@9@5xe" filled="f" stroked="f">
@@ -5707,7 +5734,7 @@
             </wp:anchor>
           </w:drawing>
         </mc:Choice>
-        <mc:Fallback>
+        <mc:Fallback xmlns:w16sdtfl="http://schemas.microsoft.com/office/word/2024/wordml/sdtformatlock" xmlns:w16du="http://schemas.microsoft.com/office/word/2023/wordml/word16du">
           <w:pict>
             <v:shape w14:anchorId="4AD14AD8" id="Text Box 5" o:spid="_x0000_s1037" type="#_x0000_t202" style="position:absolute;left:0;text-align:left;margin-left:398.6pt;margin-top:-27.7pt;width:44.9pt;height:25.3pt;z-index:251692032;visibility:visible;mso-wrap-style:square;mso-width-percent:0;mso-height-percent:0;mso-wrap-distance-left:9pt;mso-wrap-distance-top:0;mso-wrap-distance-right:9pt;mso-wrap-distance-bottom:0;mso-position-horizontal:absolute;mso-position-horizontal-relative:text;mso-position-vertical:absolute;mso-position-vertical-relative:text;mso-width-percent:0;mso-height-percent:0;mso-width-relative:margin;mso-height-relative:margin;v-text-anchor:middle" o:gfxdata="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" filled="f" stroked="f">
               <v:textbox inset="0,0,0,0">
@@ -5788,7 +5815,7 @@
 </file>
 
 <file path=word/footnotes.xml><?xml version="1.0" encoding="utf-8"?>
-<w:footnotes xmlns:wpc="http://schemas.microsoft.com/office/word/2010/wordprocessingCanvas" xmlns:cx="http://schemas.microsoft.com/office/drawing/2014/chartex" xmlns:cx1="http://schemas.microsoft.com/office/drawing/2015/9/8/chartex" xmlns:cx2="http://schemas.microsoft.com/office/drawing/2015/10/21/chartex" xmlns:cx3="http://schemas.microsoft.com/office/drawing/2016/5/9/chartex" xmlns:cx4="http://schemas.microsoft.com/office/drawing/2016/5/10/chartex" xmlns:cx5="http://schemas.microsoft.com/office/drawing/2016/5/11/chartex" xmlns:cx6="http://schemas.microsoft.com/office/drawing/2016/5/12/chartex" xmlns:cx7="http://schemas.microsoft.com/office/drawing/2016/5/13/chartex" xmlns:cx8="http://schemas.microsoft.com/office/drawing/2016/5/14/chartex" xmlns:mc="http://schemas.openxmlformats.org/markup-compatibility/2006" xmlns:aink="http://schemas.microsoft.com/office/drawing/2016/ink" xmlns:am3d="http://schemas.microsoft.com/office/drawing/2017/model3d" xmlns:o="urn:schemas-microsoft-com:office:office" xmlns:oel="http://schemas.microsoft.com/office/2019/extlst" xmlns:r="http://schemas.openxmlformats.org/officeDocument/2006/relationships" xmlns:m="http://schemas.openxmlformats.org/officeDocument/2006/math" xmlns:v="urn:schemas-microsoft-com:vml" xmlns:wp14="http://schemas.microsoft.com/office/word/2010/wordprocessingDrawing" xmlns:wp="http://schemas.openxmlformats.org/drawingml/2006/wordprocessingDrawing" xmlns:w10="urn:schemas-microsoft-com:office:word" xmlns:w="http://schemas.openxmlformats.org/wordprocessingml/2006/main" xmlns:w14="http://schemas.microsoft.com/office/word/2010/wordml" xmlns:w15="http://schemas.microsoft.com/office/word/2012/wordml" xmlns:w16cex="http://schemas.microsoft.com/office/word/2018/wordml/cex" xmlns:w16cid="http://schemas.microsoft.com/office/word/2016/wordml/cid" xmlns:w16="http://schemas.microsoft.com/office/word/2018/wordml" xmlns:w16du="http://schemas.microsoft.com/office/word/2023/wordml/word16du" xmlns:w16sdtdh="http://schemas.microsoft.com/office/word/2020/wordml/sdtdatahash" xmlns:w16sdtfl="http://schemas.microsoft.com/office/word/2024/wordml/sdtformatlock" xmlns:w16se="http://schemas.microsoft.com/office/word/2015/wordml/symex" xmlns:wpg="http://schemas.microsoft.com/office/word/2010/wordprocessingGroup" xmlns:wpi="http://schemas.microsoft.com/office/word/2010/wordprocessingInk" xmlns:wne="http://schemas.microsoft.com/office/word/2006/wordml" xmlns:wps="http://schemas.microsoft.com/office/word/2010/wordprocessingShape" mc:Ignorable="w14 w15 w16se w16cid w16 w16cex w16sdtdh w16sdtfl w16du wp14">
+<w:footnotes xmlns:wpc="http://schemas.microsoft.com/office/word/2010/wordprocessingCanvas" xmlns:cx="http://schemas.microsoft.com/office/drawing/2014/chartex" xmlns:cx1="http://schemas.microsoft.com/office/drawing/2015/9/8/chartex" xmlns:cx2="http://schemas.microsoft.com/office/drawing/2015/10/21/chartex" xmlns:cx3="http://schemas.microsoft.com/office/drawing/2016/5/9/chartex" xmlns:cx4="http://schemas.microsoft.com/office/drawing/2016/5/10/chartex" xmlns:cx5="http://schemas.microsoft.com/office/drawing/2016/5/11/chartex" xmlns:cx6="http://schemas.microsoft.com/office/drawing/2016/5/12/chartex" xmlns:cx7="http://schemas.microsoft.com/office/drawing/2016/5/13/chartex" xmlns:cx8="http://schemas.microsoft.com/office/drawing/2016/5/14/chartex" xmlns:mc="http://schemas.openxmlformats.org/markup-compatibility/2006" xmlns:aink="http://schemas.microsoft.com/office/drawing/2016/ink" xmlns:am3d="http://schemas.microsoft.com/office/drawing/2017/model3d" xmlns:o="urn:schemas-microsoft-com:office:office" xmlns:oel="http://schemas.microsoft.com/office/2019/extlst" xmlns:r="http://schemas.openxmlformats.org/officeDocument/2006/relationships" xmlns:m="http://schemas.openxmlformats.org/officeDocument/2006/math" xmlns:v="urn:schemas-microsoft-com:vml" xmlns:wp14="http://schemas.microsoft.com/office/word/2010/wordprocessingDrawing" xmlns:wp="http://schemas.openxmlformats.org/drawingml/2006/wordprocessingDrawing" xmlns:w10="urn:schemas-microsoft-com:office:word" xmlns:w="http://schemas.openxmlformats.org/wordprocessingml/2006/main" xmlns:w14="http://schemas.microsoft.com/office/word/2010/wordml" xmlns:w15="http://schemas.microsoft.com/office/word/2012/wordml" xmlns:w16cex="http://schemas.microsoft.com/office/word/2018/wordml/cex" xmlns:w16cid="http://schemas.microsoft.com/office/word/2016/wordml/cid" xmlns:w16="http://schemas.microsoft.com/office/word/2018/wordml" xmlns:w16sdtdh="http://schemas.microsoft.com/office/word/2020/wordml/sdtdatahash" xmlns:w16se="http://schemas.microsoft.com/office/word/2015/wordml/symex" xmlns:wpg="http://schemas.microsoft.com/office/word/2010/wordprocessingGroup" xmlns:wpi="http://schemas.microsoft.com/office/word/2010/wordprocessingInk" xmlns:wne="http://schemas.microsoft.com/office/word/2006/wordml" xmlns:wps="http://schemas.microsoft.com/office/word/2010/wordprocessingShape" mc:Ignorable="w14 w15 w16se w16cid w16 w16cex w16sdtdh wp14">
   <w:footnote w:type="separator" w:id="-1">
     <w:p>
       <w:pPr>
@@ -5813,7 +5840,7 @@
 </file>
 
 <file path=word/header1.xml><?xml version="1.0" encoding="utf-8"?>
-<w:hdr xmlns:wpc="http://schemas.microsoft.com/office/word/2010/wordprocessingCanvas" xmlns:cx="http://schemas.microsoft.com/office/drawing/2014/chartex" xmlns:cx1="http://schemas.microsoft.com/office/drawing/2015/9/8/chartex" xmlns:cx2="http://schemas.microsoft.com/office/drawing/2015/10/21/chartex" xmlns:cx3="http://schemas.microsoft.com/office/drawing/2016/5/9/chartex" xmlns:cx4="http://schemas.microsoft.com/office/drawing/2016/5/10/chartex" xmlns:cx5="http://schemas.microsoft.com/office/drawing/2016/5/11/chartex" xmlns:cx6="http://schemas.microsoft.com/office/drawing/2016/5/12/chartex" xmlns:cx7="http://schemas.microsoft.com/office/drawing/2016/5/13/chartex" xmlns:cx8="http://schemas.microsoft.com/office/drawing/2016/5/14/chartex" xmlns:mc="http://schemas.openxmlformats.org/markup-compatibility/2006" xmlns:aink="http://schemas.microsoft.com/office/drawing/2016/ink" xmlns:am3d="http://schemas.microsoft.com/office/drawing/2017/model3d" xmlns:o="urn:schemas-microsoft-com:office:office" xmlns:oel="http://schemas.microsoft.com/office/2019/extlst" xmlns:r="http://schemas.openxmlformats.org/officeDocument/2006/relationships" xmlns:m="http://schemas.openxmlformats.org/officeDocument/2006/math" xmlns:v="urn:schemas-microsoft-com:vml" xmlns:wp14="http://schemas.microsoft.com/office/word/2010/wordprocessingDrawing" xmlns:wp="http://schemas.openxmlformats.org/drawingml/2006/wordprocessingDrawing" xmlns:w10="urn:schemas-microsoft-com:office:word" xmlns:w="http://schemas.openxmlformats.org/wordprocessingml/2006/main" xmlns:w14="http://schemas.microsoft.com/office/word/2010/wordml" xmlns:w15="http://schemas.microsoft.com/office/word/2012/wordml" xmlns:w16cex="http://schemas.microsoft.com/office/word/2018/wordml/cex" xmlns:w16cid="http://schemas.microsoft.com/office/word/2016/wordml/cid" xmlns:w16="http://schemas.microsoft.com/office/word/2018/wordml" xmlns:w16du="http://schemas.microsoft.com/office/word/2023/wordml/word16du" xmlns:w16sdtdh="http://schemas.microsoft.com/office/word/2020/wordml/sdtdatahash" xmlns:w16sdtfl="http://schemas.microsoft.com/office/word/2024/wordml/sdtformatlock" xmlns:w16se="http://schemas.microsoft.com/office/word/2015/wordml/symex" xmlns:wpg="http://schemas.microsoft.com/office/word/2010/wordprocessingGroup" xmlns:wpi="http://schemas.microsoft.com/office/word/2010/wordprocessingInk" xmlns:wne="http://schemas.microsoft.com/office/word/2006/wordml" xmlns:wps="http://schemas.microsoft.com/office/word/2010/wordprocessingShape" mc:Ignorable="w14 w15 w16se w16cid w16 w16cex w16sdtdh w16sdtfl w16du wp14">
+<w:hdr xmlns:wpc="http://schemas.microsoft.com/office/word/2010/wordprocessingCanvas" xmlns:cx="http://schemas.microsoft.com/office/drawing/2014/chartex" xmlns:cx1="http://schemas.microsoft.com/office/drawing/2015/9/8/chartex" xmlns:cx2="http://schemas.microsoft.com/office/drawing/2015/10/21/chartex" xmlns:cx3="http://schemas.microsoft.com/office/drawing/2016/5/9/chartex" xmlns:cx4="http://schemas.microsoft.com/office/drawing/2016/5/10/chartex" xmlns:cx5="http://schemas.microsoft.com/office/drawing/2016/5/11/chartex" xmlns:cx6="http://schemas.microsoft.com/office/drawing/2016/5/12/chartex" xmlns:cx7="http://schemas.microsoft.com/office/drawing/2016/5/13/chartex" xmlns:cx8="http://schemas.microsoft.com/office/drawing/2016/5/14/chartex" xmlns:mc="http://schemas.openxmlformats.org/markup-compatibility/2006" xmlns:aink="http://schemas.microsoft.com/office/drawing/2016/ink" xmlns:am3d="http://schemas.microsoft.com/office/drawing/2017/model3d" xmlns:o="urn:schemas-microsoft-com:office:office" xmlns:oel="http://schemas.microsoft.com/office/2019/extlst" xmlns:r="http://schemas.openxmlformats.org/officeDocument/2006/relationships" xmlns:m="http://schemas.openxmlformats.org/officeDocument/2006/math" xmlns:v="urn:schemas-microsoft-com:vml" xmlns:wp14="http://schemas.microsoft.com/office/word/2010/wordprocessingDrawing" xmlns:wp="http://schemas.openxmlformats.org/drawingml/2006/wordprocessingDrawing" xmlns:w10="urn:schemas-microsoft-com:office:word" xmlns:w="http://schemas.openxmlformats.org/wordprocessingml/2006/main" xmlns:w14="http://schemas.microsoft.com/office/word/2010/wordml" xmlns:w15="http://schemas.microsoft.com/office/word/2012/wordml" xmlns:w16cex="http://schemas.microsoft.com/office/word/2018/wordml/cex" xmlns:w16cid="http://schemas.microsoft.com/office/word/2016/wordml/cid" xmlns:w16="http://schemas.microsoft.com/office/word/2018/wordml" xmlns:w16sdtdh="http://schemas.microsoft.com/office/word/2020/wordml/sdtdatahash" xmlns:w16se="http://schemas.microsoft.com/office/word/2015/wordml/symex" xmlns:wpg="http://schemas.microsoft.com/office/word/2010/wordprocessingGroup" xmlns:wpi="http://schemas.microsoft.com/office/word/2010/wordprocessingInk" xmlns:wne="http://schemas.microsoft.com/office/word/2006/wordml" xmlns:wps="http://schemas.microsoft.com/office/word/2010/wordprocessingShape" mc:Ignorable="w14 w15 w16se w16cid w16 w16cex w16sdtdh wp14">
   <w:p>
     <w:pPr>
       <w:pStyle w:val="Encabezado"/>
@@ -5878,7 +5905,7 @@
 </file>
 
 <file path=word/header2.xml><?xml version="1.0" encoding="utf-8"?>
-<w:hdr xmlns:wpc="http://schemas.microsoft.com/office/word/2010/wordprocessingCanvas" xmlns:cx="http://schemas.microsoft.com/office/drawing/2014/chartex" xmlns:cx1="http://schemas.microsoft.com/office/drawing/2015/9/8/chartex" xmlns:cx2="http://schemas.microsoft.com/office/drawing/2015/10/21/chartex" xmlns:cx3="http://schemas.microsoft.com/office/drawing/2016/5/9/chartex" xmlns:cx4="http://schemas.microsoft.com/office/drawing/2016/5/10/chartex" xmlns:cx5="http://schemas.microsoft.com/office/drawing/2016/5/11/chartex" xmlns:cx6="http://schemas.microsoft.com/office/drawing/2016/5/12/chartex" xmlns:cx7="http://schemas.microsoft.com/office/drawing/2016/5/13/chartex" xmlns:cx8="http://schemas.microsoft.com/office/drawing/2016/5/14/chartex" xmlns:mc="http://schemas.openxmlformats.org/markup-compatibility/2006" xmlns:aink="http://schemas.microsoft.com/office/drawing/2016/ink" xmlns:am3d="http://schemas.microsoft.com/office/drawing/2017/model3d" xmlns:o="urn:schemas-microsoft-com:office:office" xmlns:oel="http://schemas.microsoft.com/office/2019/extlst" xmlns:r="http://schemas.openxmlformats.org/officeDocument/2006/relationships" xmlns:m="http://schemas.openxmlformats.org/officeDocument/2006/math" xmlns:v="urn:schemas-microsoft-com:vml" xmlns:wp14="http://schemas.microsoft.com/office/word/2010/wordprocessingDrawing" xmlns:wp="http://schemas.openxmlformats.org/drawingml/2006/wordprocessingDrawing" xmlns:w10="urn:schemas-microsoft-com:office:word" xmlns:w="http://schemas.openxmlformats.org/wordprocessingml/2006/main" xmlns:w14="http://schemas.microsoft.com/office/word/2010/wordml" xmlns:w15="http://schemas.microsoft.com/office/word/2012/wordml" xmlns:w16cex="http://schemas.microsoft.com/office/word/2018/wordml/cex" xmlns:w16cid="http://schemas.microsoft.com/office/word/2016/wordml/cid" xmlns:w16="http://schemas.microsoft.com/office/word/2018/wordml" xmlns:w16du="http://schemas.microsoft.com/office/word/2023/wordml/word16du" xmlns:w16sdtdh="http://schemas.microsoft.com/office/word/2020/wordml/sdtdatahash" xmlns:w16sdtfl="http://schemas.microsoft.com/office/word/2024/wordml/sdtformatlock" xmlns:w16se="http://schemas.microsoft.com/office/word/2015/wordml/symex" xmlns:wpg="http://schemas.microsoft.com/office/word/2010/wordprocessingGroup" xmlns:wpi="http://schemas.microsoft.com/office/word/2010/wordprocessingInk" xmlns:wne="http://schemas.microsoft.com/office/word/2006/wordml" xmlns:wps="http://schemas.microsoft.com/office/word/2010/wordprocessingShape" mc:Ignorable="w14 w15 w16se w16cid w16 w16cex w16sdtdh w16sdtfl w16du wp14">
+<w:hdr xmlns:wpc="http://schemas.microsoft.com/office/word/2010/wordprocessingCanvas" xmlns:cx="http://schemas.microsoft.com/office/drawing/2014/chartex" xmlns:cx1="http://schemas.microsoft.com/office/drawing/2015/9/8/chartex" xmlns:cx2="http://schemas.microsoft.com/office/drawing/2015/10/21/chartex" xmlns:cx3="http://schemas.microsoft.com/office/drawing/2016/5/9/chartex" xmlns:cx4="http://schemas.microsoft.com/office/drawing/2016/5/10/chartex" xmlns:cx5="http://schemas.microsoft.com/office/drawing/2016/5/11/chartex" xmlns:cx6="http://schemas.microsoft.com/office/drawing/2016/5/12/chartex" xmlns:cx7="http://schemas.microsoft.com/office/drawing/2016/5/13/chartex" xmlns:cx8="http://schemas.microsoft.com/office/drawing/2016/5/14/chartex" xmlns:mc="http://schemas.openxmlformats.org/markup-compatibility/2006" xmlns:aink="http://schemas.microsoft.com/office/drawing/2016/ink" xmlns:am3d="http://schemas.microsoft.com/office/drawing/2017/model3d" xmlns:o="urn:schemas-microsoft-com:office:office" xmlns:oel="http://schemas.microsoft.com/office/2019/extlst" xmlns:r="http://schemas.openxmlformats.org/officeDocument/2006/relationships" xmlns:m="http://schemas.openxmlformats.org/officeDocument/2006/math" xmlns:v="urn:schemas-microsoft-com:vml" xmlns:wp14="http://schemas.microsoft.com/office/word/2010/wordprocessingDrawing" xmlns:wp="http://schemas.openxmlformats.org/drawingml/2006/wordprocessingDrawing" xmlns:w10="urn:schemas-microsoft-com:office:word" xmlns:w="http://schemas.openxmlformats.org/wordprocessingml/2006/main" xmlns:w14="http://schemas.microsoft.com/office/word/2010/wordml" xmlns:w15="http://schemas.microsoft.com/office/word/2012/wordml" xmlns:w16cex="http://schemas.microsoft.com/office/word/2018/wordml/cex" xmlns:w16cid="http://schemas.microsoft.com/office/word/2016/wordml/cid" xmlns:w16="http://schemas.microsoft.com/office/word/2018/wordml" xmlns:w16sdtdh="http://schemas.microsoft.com/office/word/2020/wordml/sdtdatahash" xmlns:w16se="http://schemas.microsoft.com/office/word/2015/wordml/symex" xmlns:wpg="http://schemas.microsoft.com/office/word/2010/wordprocessingGroup" xmlns:wpi="http://schemas.microsoft.com/office/word/2010/wordprocessingInk" xmlns:wne="http://schemas.microsoft.com/office/word/2006/wordml" xmlns:wps="http://schemas.microsoft.com/office/word/2010/wordprocessingShape" mc:Ignorable="w14 w15 w16se w16cid w16 w16cex w16sdtdh wp14">
   <w:p>
     <w:pPr>
       <w:pStyle w:val="Encabezado"/>
@@ -5957,7 +5984,7 @@
 </file>
 
 <file path=word/numbering.xml><?xml version="1.0" encoding="utf-8"?>
-<w:numbering xmlns:wpc="http://schemas.microsoft.com/office/word/2010/wordprocessingCanvas" xmlns:cx="http://schemas.microsoft.com/office/drawing/2014/chartex" xmlns:cx1="http://schemas.microsoft.com/office/drawing/2015/9/8/chartex" xmlns:cx2="http://schemas.microsoft.com/office/drawing/2015/10/21/chartex" xmlns:cx3="http://schemas.microsoft.com/office/drawing/2016/5/9/chartex" xmlns:cx4="http://schemas.microsoft.com/office/drawing/2016/5/10/chartex" xmlns:cx5="http://schemas.microsoft.com/office/drawing/2016/5/11/chartex" xmlns:cx6="http://schemas.microsoft.com/office/drawing/2016/5/12/chartex" xmlns:cx7="http://schemas.microsoft.com/office/drawing/2016/5/13/chartex" xmlns:cx8="http://schemas.microsoft.com/office/drawing/2016/5/14/chartex" xmlns:mc="http://schemas.openxmlformats.org/markup-compatibility/2006" xmlns:aink="http://schemas.microsoft.com/office/drawing/2016/ink" xmlns:am3d="http://schemas.microsoft.com/office/drawing/2017/model3d" xmlns:o="urn:schemas-microsoft-com:office:office" xmlns:oel="http://schemas.microsoft.com/office/2019/extlst" xmlns:r="http://schemas.openxmlformats.org/officeDocument/2006/relationships" xmlns:m="http://schemas.openxmlformats.org/officeDocument/2006/math" xmlns:v="urn:schemas-microsoft-com:vml" xmlns:wp14="http://schemas.microsoft.com/office/word/2010/wordprocessingDrawing" xmlns:wp="http://schemas.openxmlformats.org/drawingml/2006/wordprocessingDrawing" xmlns:w10="urn:schemas-microsoft-com:office:word" xmlns:w="http://schemas.openxmlformats.org/wordprocessingml/2006/main" xmlns:w14="http://schemas.microsoft.com/office/word/2010/wordml" xmlns:w15="http://schemas.microsoft.com/office/word/2012/wordml" xmlns:w16cex="http://schemas.microsoft.com/office/word/2018/wordml/cex" xmlns:w16cid="http://schemas.microsoft.com/office/word/2016/wordml/cid" xmlns:w16="http://schemas.microsoft.com/office/word/2018/wordml" xmlns:w16du="http://schemas.microsoft.com/office/word/2023/wordml/word16du" xmlns:w16sdtdh="http://schemas.microsoft.com/office/word/2020/wordml/sdtdatahash" xmlns:w16sdtfl="http://schemas.microsoft.com/office/word/2024/wordml/sdtformatlock" xmlns:w16se="http://schemas.microsoft.com/office/word/2015/wordml/symex" xmlns:wpg="http://schemas.microsoft.com/office/word/2010/wordprocessingGroup" xmlns:wpi="http://schemas.microsoft.com/office/word/2010/wordprocessingInk" xmlns:wne="http://schemas.microsoft.com/office/word/2006/wordml" xmlns:wps="http://schemas.microsoft.com/office/word/2010/wordprocessingShape" mc:Ignorable="w14 w15 w16se w16cid w16 w16cex w16sdtdh w16sdtfl w16du wp14">
+<w:numbering xmlns:wpc="http://schemas.microsoft.com/office/word/2010/wordprocessingCanvas" xmlns:cx="http://schemas.microsoft.com/office/drawing/2014/chartex" xmlns:cx1="http://schemas.microsoft.com/office/drawing/2015/9/8/chartex" xmlns:cx2="http://schemas.microsoft.com/office/drawing/2015/10/21/chartex" xmlns:cx3="http://schemas.microsoft.com/office/drawing/2016/5/9/chartex" xmlns:cx4="http://schemas.microsoft.com/office/drawing/2016/5/10/chartex" xmlns:cx5="http://schemas.microsoft.com/office/drawing/2016/5/11/chartex" xmlns:cx6="http://schemas.microsoft.com/office/drawing/2016/5/12/chartex" xmlns:cx7="http://schemas.microsoft.com/office/drawing/2016/5/13/chartex" xmlns:cx8="http://schemas.microsoft.com/office/drawing/2016/5/14/chartex" xmlns:mc="http://schemas.openxmlformats.org/markup-compatibility/2006" xmlns:aink="http://schemas.microsoft.com/office/drawing/2016/ink" xmlns:am3d="http://schemas.microsoft.com/office/drawing/2017/model3d" xmlns:o="urn:schemas-microsoft-com:office:office" xmlns:oel="http://schemas.microsoft.com/office/2019/extlst" xmlns:r="http://schemas.openxmlformats.org/officeDocument/2006/relationships" xmlns:m="http://schemas.openxmlformats.org/officeDocument/2006/math" xmlns:v="urn:schemas-microsoft-com:vml" xmlns:wp14="http://schemas.microsoft.com/office/word/2010/wordprocessingDrawing" xmlns:wp="http://schemas.openxmlformats.org/drawingml/2006/wordprocessingDrawing" xmlns:w10="urn:schemas-microsoft-com:office:word" xmlns:w="http://schemas.openxmlformats.org/wordprocessingml/2006/main" xmlns:w14="http://schemas.microsoft.com/office/word/2010/wordml" xmlns:w15="http://schemas.microsoft.com/office/word/2012/wordml" xmlns:w16cex="http://schemas.microsoft.com/office/word/2018/wordml/cex" xmlns:w16cid="http://schemas.microsoft.com/office/word/2016/wordml/cid" xmlns:w16="http://schemas.microsoft.com/office/word/2018/wordml" xmlns:w16sdtdh="http://schemas.microsoft.com/office/word/2020/wordml/sdtdatahash" xmlns:w16se="http://schemas.microsoft.com/office/word/2015/wordml/symex" xmlns:wpg="http://schemas.microsoft.com/office/word/2010/wordprocessingGroup" xmlns:wpi="http://schemas.microsoft.com/office/word/2010/wordprocessingInk" xmlns:wne="http://schemas.microsoft.com/office/word/2006/wordml" xmlns:wps="http://schemas.microsoft.com/office/word/2010/wordprocessingShape" mc:Ignorable="w14 w15 w16se w16cid w16 w16cex w16sdtdh wp14">
   <w:abstractNum w:abstractNumId="0" w15:restartNumberingAfterBreak="0">
     <w:nsid w:val="018A4BE2"/>
     <w:multiLevelType w:val="hybridMultilevel"/>
@@ -7101,7 +7128,7 @@
 </file>
 
 <file path=word/styles.xml><?xml version="1.0" encoding="utf-8"?>
-<w:styles xmlns:mc="http://schemas.openxmlformats.org/markup-compatibility/2006" xmlns:r="http://schemas.openxmlformats.org/officeDocument/2006/relationships" xmlns:w="http://schemas.openxmlformats.org/wordprocessingml/2006/main" xmlns:w14="http://schemas.microsoft.com/office/word/2010/wordml" xmlns:w15="http://schemas.microsoft.com/office/word/2012/wordml" xmlns:w16cex="http://schemas.microsoft.com/office/word/2018/wordml/cex" xmlns:w16cid="http://schemas.microsoft.com/office/word/2016/wordml/cid" xmlns:w16="http://schemas.microsoft.com/office/word/2018/wordml" xmlns:w16du="http://schemas.microsoft.com/office/word/2023/wordml/word16du" xmlns:w16sdtdh="http://schemas.microsoft.com/office/word/2020/wordml/sdtdatahash" xmlns:w16sdtfl="http://schemas.microsoft.com/office/word/2024/wordml/sdtformatlock" xmlns:w16se="http://schemas.microsoft.com/office/word/2015/wordml/symex" mc:Ignorable="w14 w15 w16se w16cid w16 w16cex w16sdtdh w16sdtfl w16du">
+<w:styles xmlns:mc="http://schemas.openxmlformats.org/markup-compatibility/2006" xmlns:r="http://schemas.openxmlformats.org/officeDocument/2006/relationships" xmlns:w="http://schemas.openxmlformats.org/wordprocessingml/2006/main" xmlns:w14="http://schemas.microsoft.com/office/word/2010/wordml" xmlns:w15="http://schemas.microsoft.com/office/word/2012/wordml" xmlns:w16cex="http://schemas.microsoft.com/office/word/2018/wordml/cex" xmlns:w16cid="http://schemas.microsoft.com/office/word/2016/wordml/cid" xmlns:w16="http://schemas.microsoft.com/office/word/2018/wordml" xmlns:w16sdtdh="http://schemas.microsoft.com/office/word/2020/wordml/sdtdatahash" xmlns:w16se="http://schemas.microsoft.com/office/word/2015/wordml/symex" mc:Ignorable="w14 w15 w16se w16cid w16 w16cex w16sdtdh">
   <w:docDefaults>
     <w:rPrDefault>
       <w:rPr>
@@ -7632,6 +7659,7 @@
   <w:style w:type="character" w:default="1" w:styleId="Fuentedeprrafopredeter">
     <w:name w:val="Default Paragraph Font"/>
     <w:uiPriority w:val="1"/>
+    <w:semiHidden/>
     <w:unhideWhenUsed/>
   </w:style>
   <w:style w:type="table" w:default="1" w:styleId="Tablanormal">
@@ -7729,7 +7757,7 @@
     <w:uiPriority w:val="99"/>
     <w:rsid w:val="00A54EDC"/>
   </w:style>
-  <w:style w:type="character" w:styleId="Fuerte">
+  <w:style w:type="character" w:styleId="Textoennegrita">
     <w:name w:val="Strong"/>
     <w:basedOn w:val="Fuentedeprrafopredeter"/>
     <w:uiPriority w:val="22"/>

</xml_diff>